<commit_message>
Add handwritten backpropagation pages as the report appendix
Co-Authored-By: Claude Sonnet 5.5 <noreply@anthropic.com>
Claude-Session: https://claude.ai/code/session_0175EciwGbqSe5uUjBWmsUH4
</commit_message>
<xml_diff>
--- a/docs/report.docx
+++ b/docs/report.docx
@@ -2218,6 +2218,138 @@
           <w:szCs w:val="28"/>
         </w:rPr>
         <w:t xml:space="preserve">Launch.exe is unsigned, so SmartScreen may warn. Browser rendering time for the largest files and Windows benchmark timings were not measured.</w:t>
+      </w:r>
+    </w:p>
+    <w:p>
+      <w:r>
+        <w:br w:type="page"/>
+      </w:r>
+    </w:p>
+    <w:p>
+      <w:pPr>
+        <w:spacing w:after="60"/>
+        <w:jc w:val="center"/>
+      </w:pPr>
+      <w:r>
+        <w:rPr>
+          <w:rFonts w:ascii="Arial" w:cs="Arial" w:eastAsia="Arial" w:hAnsi="Arial"/>
+          <w:b/>
+          <w:bCs/>
+          <w:sz w:val="28"/>
+          <w:szCs w:val="28"/>
+        </w:rPr>
+        <w:t xml:space="preserve">Appendix: handwritten backpropagation (page 1 of 2)</w:t>
+      </w:r>
+    </w:p>
+    <w:p>
+      <w:pPr>
+        <w:jc w:val="center"/>
+      </w:pPr>
+      <w:r>
+        <w:drawing>
+          <wp:inline distT="0" distB="0" distL="0" distR="0">
+            <wp:extent cx="5143500" cy="8686800"/>
+            <wp:effectExtent t="0" r="0" b="0" l="0"/>
+            <wp:docPr id="5" name="docs/handwritten/backprop_page1.jpg" descr="docs/handwritten/backprop_page1.jpg" title="docs/handwritten/backprop_page1.jpg"/>
+            <wp:cNvGraphicFramePr>
+              <a:graphicFrameLocks xmlns:a="http://schemas.openxmlformats.org/drawingml/2006/main" noChangeAspect="1"/>
+            </wp:cNvGraphicFramePr>
+            <a:graphic xmlns:a="http://schemas.openxmlformats.org/drawingml/2006/main">
+              <a:graphicData uri="http://schemas.openxmlformats.org/drawingml/2006/picture">
+                <pic:pic xmlns:pic="http://schemas.openxmlformats.org/drawingml/2006/picture">
+                  <pic:nvPicPr>
+                    <pic:cNvPr id="0" name="" descr=""/>
+                    <pic:cNvPicPr>
+                      <a:picLocks noChangeAspect="1" noChangeArrowheads="1"/>
+                    </pic:cNvPicPr>
+                  </pic:nvPicPr>
+                  <pic:blipFill>
+                    <a:blip r:embed="rId11" cstate="none"/>
+                    <a:srcRect/>
+                    <a:stretch>
+                      <a:fillRect/>
+                    </a:stretch>
+                  </pic:blipFill>
+                  <pic:spPr bwMode="auto">
+                    <a:xfrm>
+                      <a:off x="0" y="0"/>
+                      <a:ext cx="5143500" cy="8686800"/>
+                    </a:xfrm>
+                    <a:prstGeom prst="rect">
+                      <a:avLst/>
+                    </a:prstGeom>
+                  </pic:spPr>
+                </pic:pic>
+              </a:graphicData>
+            </a:graphic>
+          </wp:inline>
+        </w:drawing>
+      </w:r>
+    </w:p>
+    <w:p>
+      <w:r>
+        <w:br w:type="page"/>
+      </w:r>
+    </w:p>
+    <w:p>
+      <w:pPr>
+        <w:spacing w:after="60"/>
+        <w:jc w:val="center"/>
+      </w:pPr>
+      <w:r>
+        <w:rPr>
+          <w:rFonts w:ascii="Arial" w:cs="Arial" w:eastAsia="Arial" w:hAnsi="Arial"/>
+          <w:b/>
+          <w:bCs/>
+          <w:sz w:val="28"/>
+          <w:szCs w:val="28"/>
+        </w:rPr>
+        <w:t xml:space="preserve">Appendix: handwritten backpropagation (page 2 of 2)</w:t>
+      </w:r>
+    </w:p>
+    <w:p>
+      <w:pPr>
+        <w:jc w:val="center"/>
+      </w:pPr>
+      <w:r>
+        <w:drawing>
+          <wp:inline distT="0" distB="0" distL="0" distR="0">
+            <wp:extent cx="5286375" cy="8686800"/>
+            <wp:effectExtent t="0" r="0" b="0" l="0"/>
+            <wp:docPr id="6" name="docs/handwritten/backprop_page2.jpg" descr="docs/handwritten/backprop_page2.jpg" title="docs/handwritten/backprop_page2.jpg"/>
+            <wp:cNvGraphicFramePr>
+              <a:graphicFrameLocks xmlns:a="http://schemas.openxmlformats.org/drawingml/2006/main" noChangeAspect="1"/>
+            </wp:cNvGraphicFramePr>
+            <a:graphic xmlns:a="http://schemas.openxmlformats.org/drawingml/2006/main">
+              <a:graphicData uri="http://schemas.openxmlformats.org/drawingml/2006/picture">
+                <pic:pic xmlns:pic="http://schemas.openxmlformats.org/drawingml/2006/picture">
+                  <pic:nvPicPr>
+                    <pic:cNvPr id="0" name="" descr=""/>
+                    <pic:cNvPicPr>
+                      <a:picLocks noChangeAspect="1" noChangeArrowheads="1"/>
+                    </pic:cNvPicPr>
+                  </pic:nvPicPr>
+                  <pic:blipFill>
+                    <a:blip r:embed="rId12" cstate="none"/>
+                    <a:srcRect/>
+                    <a:stretch>
+                      <a:fillRect/>
+                    </a:stretch>
+                  </pic:blipFill>
+                  <pic:spPr bwMode="auto">
+                    <a:xfrm>
+                      <a:off x="0" y="0"/>
+                      <a:ext cx="5286375" cy="8686800"/>
+                    </a:xfrm>
+                    <a:prstGeom prst="rect">
+                      <a:avLst/>
+                    </a:prstGeom>
+                  </pic:spPr>
+                </pic:pic>
+              </a:graphicData>
+            </a:graphic>
+          </wp:inline>
+        </w:drawing>
       </w:r>
     </w:p>
     <w:sectPr>

</xml_diff>

<commit_message>
Add 1 MB submission PDF (report, appendix, design, evidence, AI log) with builder scripts
The submission form accepts only a PDF of at most 1 MB, so the PDF carries the
documents and links to the full ZIP package.

Co-Authored-By: Claude Sonnet 5.5 <noreply@anthropic.com>
Claude-Session: https://claude.ai/code/session_0175EciwGbqSe5uUjBWmsUH4
</commit_message>
<xml_diff>
--- a/docs/report.docx
+++ b/docs/report.docx
@@ -998,7 +998,7 @@
                 <wp:inline distT="0" distB="0" distL="0" distR="0">
                   <wp:extent cx="3028950" cy="1828800"/>
                   <wp:effectExtent t="0" r="0" b="0" l="0"/>
-                  <wp:docPr id="1" name="docs/img/fea_temperature.png" descr="docs/img/fea_temperature.png" title="docs/img/fea_temperature.png"/>
+                  <wp:docPr id="1" name="docs/img_small/fea_temperature.jpg" descr="docs/img_small/fea_temperature.jpg" title="docs/img_small/fea_temperature.jpg"/>
                   <wp:cNvGraphicFramePr>
                     <a:graphicFrameLocks xmlns:a="http://schemas.openxmlformats.org/drawingml/2006/main" noChangeAspect="1"/>
                   </wp:cNvGraphicFramePr>
@@ -1070,7 +1070,7 @@
                 <wp:inline distT="0" distB="0" distL="0" distR="0">
                   <wp:extent cx="3028950" cy="1828800"/>
                   <wp:effectExtent t="0" r="0" b="0" l="0"/>
-                  <wp:docPr id="2" name="docs/img/fea_convergence.png" descr="docs/img/fea_convergence.png" title="docs/img/fea_convergence.png"/>
+                  <wp:docPr id="2" name="docs/img_small/fea_convergence.jpg" descr="docs/img_small/fea_convergence.jpg" title="docs/img_small/fea_convergence.jpg"/>
                   <wp:cNvGraphicFramePr>
                     <a:graphicFrameLocks xmlns:a="http://schemas.openxmlformats.org/drawingml/2006/main" noChangeAspect="1"/>
                   </wp:cNvGraphicFramePr>
@@ -1889,7 +1889,7 @@
           <wp:inline distT="0" distB="0" distL="0" distR="0">
             <wp:extent cx="6096000" cy="3400425"/>
             <wp:effectExtent t="0" r="0" b="0" l="0"/>
-            <wp:docPr id="3" name="docs/img/block_diagram.png" descr="docs/img/block_diagram.png" title="docs/img/block_diagram.png"/>
+            <wp:docPr id="3" name="docs/img_small/block_diagram.jpg" descr="docs/img_small/block_diagram.jpg" title="docs/img_small/block_diagram.jpg"/>
             <wp:cNvGraphicFramePr>
               <a:graphicFrameLocks xmlns:a="http://schemas.openxmlformats.org/drawingml/2006/main" noChangeAspect="1"/>
             </wp:cNvGraphicFramePr>
@@ -1982,7 +1982,7 @@
           <wp:inline distT="0" distB="0" distL="0" distR="0">
             <wp:extent cx="4191000" cy="2533650"/>
             <wp:effectExtent t="0" r="0" b="0" l="0"/>
-            <wp:docPr id="4" name="docs/img/backprop_loss.png" descr="docs/img/backprop_loss.png" title="docs/img/backprop_loss.png"/>
+            <wp:docPr id="4" name="docs/img_small/backprop_loss.jpg" descr="docs/img_small/backprop_loss.jpg" title="docs/img_small/backprop_loss.jpg"/>
             <wp:cNvGraphicFramePr>
               <a:graphicFrameLocks xmlns:a="http://schemas.openxmlformats.org/drawingml/2006/main" noChangeAspect="1"/>
             </wp:cNvGraphicFramePr>

</xml_diff>